<commit_message>
Do final slow-and-accurate run of analysis script.
</commit_message>
<xml_diff>
--- a/analysis_report/eliminate_rabies_trial_analysis_report_v04.docx
+++ b/analysis_report/eliminate_rabies_trial_analysis_report_v04.docx
@@ -59,7 +59,7 @@
           <w:szCs w:val="20"/>
         </w:rPr>
         <w:br/>
-        <w:t xml:space="preserve">Draft Report Version 04 </w:t>
+        <w:t xml:space="preserve">Final Report Version 04 </w:t>
       </w:r>
     </w:p>
     <w:p>
@@ -123,7 +123,7 @@
           <w:szCs w:val="20"/>
         </w:rPr>
         <w:br/>
-        <w:t xml:space="preserve">Wed Dec 10 10:26:55 2025 </w:t>
+        <w:t xml:space="preserve">Thu Dec 11 05:05:08 2025 </w:t>
       </w:r>
     </w:p>
     <w:p>
@@ -2206,7 +2206,7 @@
                 <w:sz w:val="18"/>
                 <w:szCs w:val="18"/>
               </w:rPr>
-              <w:t xml:space="preserve"> Primary analysis and secondary analysis 1. Coverage and intervention odds ratio estimates (95% CI) at each survey estimated from the GLMM reported in the previous table. P-values at each survey are from likelihood ratio tests of the primary analysis null hypothesis of no intervention effect at any of the six surveys and secondary analysis 1 null hypothesis of no intervention effect at any of the three visit 2 surveys. Mean coverage (95% CI), odds ratio (95% CI) and P-value across all years were estimated from 100 parametric bootstrap samples. Population: all dogs with primary outcome data.</w:t>
+              <w:t xml:space="preserve"> Primary analysis and secondary analysis 1. Coverage and intervention odds ratio estimates (95% CI) at each survey estimated from the GLMM reported in the previous table. P-values at each survey are from likelihood ratio tests of the primary analysis null hypothesis of no intervention effect at any of the six surveys and secondary analysis 1 null hypothesis of no intervention effect at any of the three visit 2 surveys. Mean coverage (95% CI), odds ratio (95% CI) and P-value across all years were estimated from 10000 parametric bootstrap samples. Population: all dogs with primary outcome data.</w:t>
             </w:r>
           </w:p>
         </w:tc>
@@ -3181,7 +3181,7 @@
                 <w:sz w:val="18"/>
                 <w:szCs w:val="18"/>
               </w:rPr>
-              <w:t>0.38 (0.31, 0.46)</w:t>
+              <w:t>0.37 (0.28, 0.46)</w:t>
             </w:r>
           </w:p>
         </w:tc>
@@ -3218,7 +3218,7 @@
                 <w:sz w:val="18"/>
                 <w:szCs w:val="18"/>
               </w:rPr>
-              <w:t>0.55 (0.47, 0.64)</w:t>
+              <w:t>0.55 (0.45, 0.65)</w:t>
             </w:r>
           </w:p>
         </w:tc>
@@ -3255,7 +3255,7 @@
                 <w:sz w:val="18"/>
                 <w:szCs w:val="18"/>
               </w:rPr>
-              <w:t>2.04 (1.61, 2.75)</w:t>
+              <w:t>2.09 (1.58, 2.75)</w:t>
             </w:r>
           </w:p>
         </w:tc>
@@ -3394,8 +3394,8 @@
         <w:tblLook w:val="04A0" w:firstRow="1" w:lastRow="0" w:firstColumn="1" w:lastColumn="0" w:noHBand="0" w:noVBand="1"/>
       </w:tblPr>
       <w:tblGrid>
-        <w:gridCol w:w="3407"/>
-        <w:gridCol w:w="4484"/>
+        <w:gridCol w:w="3408"/>
+        <w:gridCol w:w="4483"/>
         <w:gridCol w:w="5113"/>
       </w:tblGrid>
       <w:tr>
@@ -3444,7 +3444,7 @@
                 <w:sz w:val="18"/>
                 <w:szCs w:val="18"/>
               </w:rPr>
-              <w:t xml:space="preserve"> Secondary analysis 2. Estimated probability (95% CI) of village-level coverage below 40% by month and averaged over the trial year, for each trial arm. The distribution of coverage among villages was estimated from 100 parametric bootstrap samples. Population: all dogs with primary outcome data.</w:t>
+              <w:t xml:space="preserve"> Secondary analysis 2. Estimated probability (95% CI) of village-level coverage below 40% by month and averaged over the trial year, for each trial arm. The distribution of coverage among villages was estimated from 10000 parametric bootstrap samples. Population: all dogs with primary outcome data.</w:t>
             </w:r>
           </w:p>
         </w:tc>
@@ -3798,95 +3798,95 @@
                 <w:sz w:val="18"/>
                 <w:szCs w:val="18"/>
               </w:rPr>
-              <w:t>0.38 (0.17, 0.55)</w:t>
-            </w:r>
-            <w:r>
-              <w:rPr>
-                <w:sz w:val="18"/>
-                <w:szCs w:val="18"/>
-              </w:rPr>
-              <w:br/>
-              <w:t>0.41 (0.19, 0.59)</w:t>
-            </w:r>
-            <w:r>
-              <w:rPr>
-                <w:sz w:val="18"/>
-                <w:szCs w:val="18"/>
-              </w:rPr>
-              <w:br/>
-              <w:t>0.44 (0.22, 0.63)</w:t>
-            </w:r>
-            <w:r>
-              <w:rPr>
-                <w:sz w:val="18"/>
-                <w:szCs w:val="18"/>
-              </w:rPr>
-              <w:br/>
-              <w:t>0.48 (0.23, 0.69)</w:t>
-            </w:r>
-            <w:r>
-              <w:rPr>
-                <w:sz w:val="18"/>
-                <w:szCs w:val="18"/>
-              </w:rPr>
-              <w:br/>
-              <w:t>0.53 (0.26, 0.73)</w:t>
-            </w:r>
-            <w:r>
-              <w:rPr>
-                <w:sz w:val="18"/>
-                <w:szCs w:val="18"/>
-              </w:rPr>
-              <w:br/>
-              <w:t>0.57 (0.30, 0.78)</w:t>
-            </w:r>
-            <w:r>
-              <w:rPr>
-                <w:sz w:val="18"/>
-                <w:szCs w:val="18"/>
-              </w:rPr>
-              <w:br/>
-              <w:t>0.62 (0.38, 0.82)</w:t>
-            </w:r>
-            <w:r>
-              <w:rPr>
-                <w:sz w:val="18"/>
-                <w:szCs w:val="18"/>
-              </w:rPr>
-              <w:br/>
-              <w:t>0.66 (0.44, 0.86)</w:t>
-            </w:r>
-            <w:r>
-              <w:rPr>
-                <w:sz w:val="18"/>
-                <w:szCs w:val="18"/>
-              </w:rPr>
-              <w:br/>
-              <w:t>0.70 (0.49, 0.88)</w:t>
-            </w:r>
-            <w:r>
-              <w:rPr>
-                <w:sz w:val="18"/>
-                <w:szCs w:val="18"/>
-              </w:rPr>
-              <w:br/>
-              <w:t>0.73 (0.52, 0.90)</w:t>
-            </w:r>
-            <w:r>
-              <w:rPr>
-                <w:sz w:val="18"/>
-                <w:szCs w:val="18"/>
-              </w:rPr>
-              <w:br/>
-              <w:t>0.76 (0.55, 0.93)</w:t>
-            </w:r>
-            <w:r>
-              <w:rPr>
-                <w:sz w:val="18"/>
-                <w:szCs w:val="18"/>
-              </w:rPr>
-              <w:br/>
-              <w:t>0.78 (0.59, 0.94)</w:t>
+              <w:t>0.40 (0.19, 0.62)</w:t>
+            </w:r>
+            <w:r>
+              <w:rPr>
+                <w:sz w:val="18"/>
+                <w:szCs w:val="18"/>
+              </w:rPr>
+              <w:br/>
+              <w:t>0.43 (0.21, 0.66)</w:t>
+            </w:r>
+            <w:r>
+              <w:rPr>
+                <w:sz w:val="18"/>
+                <w:szCs w:val="18"/>
+              </w:rPr>
+              <w:br/>
+              <w:t>0.46 (0.23, 0.70)</w:t>
+            </w:r>
+            <w:r>
+              <w:rPr>
+                <w:sz w:val="18"/>
+                <w:szCs w:val="18"/>
+              </w:rPr>
+              <w:br/>
+              <w:t>0.50 (0.26, 0.74)</w:t>
+            </w:r>
+            <w:r>
+              <w:rPr>
+                <w:sz w:val="18"/>
+                <w:szCs w:val="18"/>
+              </w:rPr>
+              <w:br/>
+              <w:t>0.54 (0.30, 0.78)</w:t>
+            </w:r>
+            <w:r>
+              <w:rPr>
+                <w:sz w:val="18"/>
+                <w:szCs w:val="18"/>
+              </w:rPr>
+              <w:br/>
+              <w:t>0.59 (0.33, 0.82)</w:t>
+            </w:r>
+            <w:r>
+              <w:rPr>
+                <w:sz w:val="18"/>
+                <w:szCs w:val="18"/>
+              </w:rPr>
+              <w:br/>
+              <w:t>0.63 (0.38, 0.86)</w:t>
+            </w:r>
+            <w:r>
+              <w:rPr>
+                <w:sz w:val="18"/>
+                <w:szCs w:val="18"/>
+              </w:rPr>
+              <w:br/>
+              <w:t>0.67 (0.42, 0.89)</w:t>
+            </w:r>
+            <w:r>
+              <w:rPr>
+                <w:sz w:val="18"/>
+                <w:szCs w:val="18"/>
+              </w:rPr>
+              <w:br/>
+              <w:t>0.71 (0.46, 0.91)</w:t>
+            </w:r>
+            <w:r>
+              <w:rPr>
+                <w:sz w:val="18"/>
+                <w:szCs w:val="18"/>
+              </w:rPr>
+              <w:br/>
+              <w:t>0.75 (0.51, 0.93)</w:t>
+            </w:r>
+            <w:r>
+              <w:rPr>
+                <w:sz w:val="18"/>
+                <w:szCs w:val="18"/>
+              </w:rPr>
+              <w:br/>
+              <w:t>0.77 (0.54, 0.94)</w:t>
+            </w:r>
+            <w:r>
+              <w:rPr>
+                <w:sz w:val="18"/>
+                <w:szCs w:val="18"/>
+              </w:rPr>
+              <w:br/>
+              <w:t>0.80 (0.57, 0.95)</w:t>
             </w:r>
           </w:p>
         </w:tc>
@@ -3923,95 +3923,95 @@
                 <w:sz w:val="18"/>
                 <w:szCs w:val="18"/>
               </w:rPr>
-              <w:t>0.20 (0.05, 0.35)</w:t>
-            </w:r>
-            <w:r>
-              <w:rPr>
-                <w:sz w:val="18"/>
-                <w:szCs w:val="18"/>
-              </w:rPr>
-              <w:br/>
-              <w:t>0.19 (0.05, 0.35)</w:t>
-            </w:r>
-            <w:r>
-              <w:rPr>
-                <w:sz w:val="18"/>
-                <w:szCs w:val="18"/>
-              </w:rPr>
-              <w:br/>
-              <w:t>0.18 (0.04, 0.35)</w:t>
-            </w:r>
-            <w:r>
-              <w:rPr>
-                <w:sz w:val="18"/>
-                <w:szCs w:val="18"/>
-              </w:rPr>
-              <w:br/>
-              <w:t>0.17 (0.03, 0.35)</w:t>
-            </w:r>
-            <w:r>
-              <w:rPr>
-                <w:sz w:val="18"/>
-                <w:szCs w:val="18"/>
-              </w:rPr>
-              <w:br/>
-              <w:t>0.16 (0.03, 0.34)</w:t>
-            </w:r>
-            <w:r>
-              <w:rPr>
-                <w:sz w:val="18"/>
-                <w:szCs w:val="18"/>
-              </w:rPr>
-              <w:br/>
-              <w:t>0.16 (0.02, 0.35)</w:t>
-            </w:r>
-            <w:r>
-              <w:rPr>
-                <w:sz w:val="18"/>
-                <w:szCs w:val="18"/>
-              </w:rPr>
-              <w:br/>
-              <w:t>0.16 (0.02, 0.33)</w:t>
-            </w:r>
-            <w:r>
-              <w:rPr>
-                <w:sz w:val="18"/>
-                <w:szCs w:val="18"/>
-              </w:rPr>
-              <w:br/>
-              <w:t>0.16 (0.02, 0.33)</w:t>
-            </w:r>
-            <w:r>
-              <w:rPr>
-                <w:sz w:val="18"/>
-                <w:szCs w:val="18"/>
-              </w:rPr>
-              <w:br/>
-              <w:t>0.17 (0.02, 0.35)</w:t>
-            </w:r>
-            <w:r>
-              <w:rPr>
-                <w:sz w:val="18"/>
-                <w:szCs w:val="18"/>
-              </w:rPr>
-              <w:br/>
-              <w:t>0.18 (0.03, 0.36)</w:t>
-            </w:r>
-            <w:r>
-              <w:rPr>
-                <w:sz w:val="18"/>
-                <w:szCs w:val="18"/>
-              </w:rPr>
-              <w:br/>
-              <w:t>0.19 (0.04, 0.37)</w:t>
-            </w:r>
-            <w:r>
-              <w:rPr>
-                <w:sz w:val="18"/>
-                <w:szCs w:val="18"/>
-              </w:rPr>
-              <w:br/>
-              <w:t>0.21 (0.04, 0.40)</w:t>
+              <w:t>0.20 (0.05, 0.41)</w:t>
+            </w:r>
+            <w:r>
+              <w:rPr>
+                <w:sz w:val="18"/>
+                <w:szCs w:val="18"/>
+              </w:rPr>
+              <w:br/>
+              <w:t>0.19 (0.05, 0.40)</w:t>
+            </w:r>
+            <w:r>
+              <w:rPr>
+                <w:sz w:val="18"/>
+                <w:szCs w:val="18"/>
+              </w:rPr>
+              <w:br/>
+              <w:t>0.19 (0.04, 0.40)</w:t>
+            </w:r>
+            <w:r>
+              <w:rPr>
+                <w:sz w:val="18"/>
+                <w:szCs w:val="18"/>
+              </w:rPr>
+              <w:br/>
+              <w:t>0.18 (0.04, 0.40)</w:t>
+            </w:r>
+            <w:r>
+              <w:rPr>
+                <w:sz w:val="18"/>
+                <w:szCs w:val="18"/>
+              </w:rPr>
+              <w:br/>
+              <w:t>0.17 (0.03, 0.40)</w:t>
+            </w:r>
+            <w:r>
+              <w:rPr>
+                <w:sz w:val="18"/>
+                <w:szCs w:val="18"/>
+              </w:rPr>
+              <w:br/>
+              <w:t>0.17 (0.02, 0.40)</w:t>
+            </w:r>
+            <w:r>
+              <w:rPr>
+                <w:sz w:val="18"/>
+                <w:szCs w:val="18"/>
+              </w:rPr>
+              <w:br/>
+              <w:t>0.17 (0.02, 0.40)</w:t>
+            </w:r>
+            <w:r>
+              <w:rPr>
+                <w:sz w:val="18"/>
+                <w:szCs w:val="18"/>
+              </w:rPr>
+              <w:br/>
+              <w:t>0.17 (0.02, 0.40)</w:t>
+            </w:r>
+            <w:r>
+              <w:rPr>
+                <w:sz w:val="18"/>
+                <w:szCs w:val="18"/>
+              </w:rPr>
+              <w:br/>
+              <w:t>0.18 (0.02, 0.41)</w:t>
+            </w:r>
+            <w:r>
+              <w:rPr>
+                <w:sz w:val="18"/>
+                <w:szCs w:val="18"/>
+              </w:rPr>
+              <w:br/>
+              <w:t>0.18 (0.03, 0.42)</w:t>
+            </w:r>
+            <w:r>
+              <w:rPr>
+                <w:sz w:val="18"/>
+                <w:szCs w:val="18"/>
+              </w:rPr>
+              <w:br/>
+              <w:t>0.20 (0.04, 0.43)</w:t>
+            </w:r>
+            <w:r>
+              <w:rPr>
+                <w:sz w:val="18"/>
+                <w:szCs w:val="18"/>
+              </w:rPr>
+              <w:br/>
+              <w:t>0.21 (0.05, 0.45)</w:t>
             </w:r>
           </w:p>
         </w:tc>
@@ -4087,7 +4087,7 @@
                 <w:sz w:val="18"/>
                 <w:szCs w:val="18"/>
               </w:rPr>
-              <w:t>0.59 (0.38, 0.77)</w:t>
+              <w:t>0.60 (0.38, 0.81)</w:t>
             </w:r>
           </w:p>
         </w:tc>
@@ -4124,7 +4124,7 @@
                 <w:sz w:val="18"/>
                 <w:szCs w:val="18"/>
               </w:rPr>
-              <w:t>0.18 (0.03, 0.35)</w:t>
+              <w:t>0.18 (0.04, 0.40)</w:t>
             </w:r>
           </w:p>
         </w:tc>
@@ -4421,15 +4421,15 @@
                 <w:sz w:val="18"/>
                 <w:szCs w:val="18"/>
               </w:rPr>
-              <w:t>0.67 (0.56, 0.79)</w:t>
-            </w:r>
-            <w:r>
-              <w:rPr>
-                <w:sz w:val="18"/>
-                <w:szCs w:val="18"/>
-              </w:rPr>
-              <w:br/>
-              <w:t>2.15 (0.28, 16.00)</w:t>
+              <w:t>0.67 (0.56, 0.83)</w:t>
+            </w:r>
+            <w:r>
+              <w:rPr>
+                <w:sz w:val="18"/>
+                <w:szCs w:val="18"/>
+              </w:rPr>
+              <w:br/>
+              <w:t>2.16 (0.05, 16.06)</w:t>
             </w:r>
           </w:p>
         </w:tc>
@@ -12800,7 +12800,7 @@
           <w:szCs w:val="20"/>
         </w:rPr>
         <w:drawing>
-          <wp:inline distT="0" distB="0" distL="0" distR="0" wp14:anchorId="467700E4" wp14:editId="5E69F484">
+          <wp:inline distT="0" distB="0" distL="0" distR="0" wp14:anchorId="30F9867D" wp14:editId="6FA92CC5">
             <wp:extent cx="6096000" cy="4572000"/>
             <wp:effectExtent l="0" t="0" r="0" b="0"/>
             <wp:docPr id="1" name="Picture 1"/>
@@ -12932,7 +12932,7 @@
           <w:szCs w:val="20"/>
         </w:rPr>
         <w:drawing>
-          <wp:inline distT="0" distB="0" distL="0" distR="0" wp14:anchorId="21D65AB3" wp14:editId="37624A56">
+          <wp:inline distT="0" distB="0" distL="0" distR="0" wp14:anchorId="482766B8" wp14:editId="2A9C82ED">
             <wp:extent cx="5334000" cy="4572000"/>
             <wp:effectExtent l="0" t="0" r="0" b="0"/>
             <wp:docPr id="2" name="Picture 2"/>
@@ -13064,7 +13064,7 @@
           <w:szCs w:val="20"/>
         </w:rPr>
         <w:drawing>
-          <wp:inline distT="0" distB="0" distL="0" distR="0" wp14:anchorId="50CA9FC1" wp14:editId="085F9924">
+          <wp:inline distT="0" distB="0" distL="0" distR="0" wp14:anchorId="51578F05" wp14:editId="27169340">
             <wp:extent cx="6096000" cy="3302000"/>
             <wp:effectExtent l="0" t="0" r="0" b="0"/>
             <wp:docPr id="3" name="Picture 3"/>
@@ -13196,7 +13196,7 @@
           <w:szCs w:val="20"/>
         </w:rPr>
         <w:drawing>
-          <wp:inline distT="0" distB="0" distL="0" distR="0" wp14:anchorId="5682AE61" wp14:editId="6E6890D5">
+          <wp:inline distT="0" distB="0" distL="0" distR="0" wp14:anchorId="281BCF53" wp14:editId="4DED6B28">
             <wp:extent cx="4318000" cy="3048000"/>
             <wp:effectExtent l="0" t="0" r="0" b="0"/>
             <wp:docPr id="4" name="Picture 4"/>
@@ -13360,9 +13360,9 @@
           <w:szCs w:val="20"/>
         </w:rPr>
         <w:drawing>
-          <wp:inline distT="0" distB="0" distL="0" distR="0" wp14:anchorId="3C89342A" wp14:editId="0B609CF4">
-            <wp:extent cx="8172938" cy="5108086"/>
-            <wp:effectExtent l="0" t="0" r="6350" b="0"/>
+          <wp:inline distT="0" distB="0" distL="0" distR="0" wp14:anchorId="2834CCBA" wp14:editId="38447E18">
+            <wp:extent cx="8269653" cy="5168533"/>
+            <wp:effectExtent l="0" t="0" r="0" b="635"/>
             <wp:docPr id="5" name="Picture 5"/>
             <wp:cNvGraphicFramePr>
               <a:graphicFrameLocks xmlns:a="http://schemas.openxmlformats.org/drawingml/2006/main" noChangeAspect="1"/>
@@ -13392,7 +13392,7 @@
                   <pic:spPr bwMode="auto">
                     <a:xfrm>
                       <a:off x="0" y="0"/>
-                      <a:ext cx="8206825" cy="5129265"/>
+                      <a:ext cx="8350675" cy="5219172"/>
                     </a:xfrm>
                     <a:prstGeom prst="rect">
                       <a:avLst/>
@@ -13492,9 +13492,9 @@
           <w:szCs w:val="20"/>
         </w:rPr>
         <w:drawing>
-          <wp:inline distT="0" distB="0" distL="0" distR="0" wp14:anchorId="668162AF" wp14:editId="4EFBE5FB">
-            <wp:extent cx="8208107" cy="5130067"/>
-            <wp:effectExtent l="0" t="0" r="0" b="1270"/>
+          <wp:inline distT="0" distB="0" distL="0" distR="0" wp14:anchorId="41DE8C4E" wp14:editId="11859FD6">
+            <wp:extent cx="8278446" cy="5174029"/>
+            <wp:effectExtent l="0" t="0" r="2540" b="0"/>
             <wp:docPr id="6" name="Picture 6"/>
             <wp:cNvGraphicFramePr>
               <a:graphicFrameLocks xmlns:a="http://schemas.openxmlformats.org/drawingml/2006/main" noChangeAspect="1"/>
@@ -13524,7 +13524,7 @@
                   <pic:spPr bwMode="auto">
                     <a:xfrm>
                       <a:off x="0" y="0"/>
-                      <a:ext cx="8268617" cy="5167886"/>
+                      <a:ext cx="8357728" cy="5223580"/>
                     </a:xfrm>
                     <a:prstGeom prst="rect">
                       <a:avLst/>

</xml_diff>